<commit_message>
Finalize 3-page report + correct CarDD split (70/20/10) in report & diagram
- CCDP_Project_Report.docx: tightened to exactly 3 pages (LibreOffice-verified),
  figures/tables intact. Corrected CarDD split to the provided 2,816/810/374
  (~70/20/10) in §2 preprocessing and §4.2 — was wrongly stated 80/10/10.
- Regenerated the CarDD flow diagram (diagram_03) with the real split.

Co-Authored-By: Claude Fable 5 <noreply@anthropic.com>
</commit_message>
<xml_diff>
--- a/submission/CCDP_Project_Report.docx
+++ b/submission/CCDP_Project_Report.docx
@@ -705,7 +705,7 @@
           <w:sz w:val="19"/>
           <w:szCs w:val="19"/>
         </w:rPr>
-        <w:t xml:space="preserve">Stanford images are cropped to their ground-truth car bounding box, resized to 224×224, and ImageNet-normalized. CarDD COCO polygons are converted to YOLO-segmentation text labels (normalized polygon vertices) and split 80/10/10. carparts-seg ships pre-split. Augmentation for the identifier: RandAugment(2, 9), random-resized-crop, horizontal flip, plus MixUp (α=0.2) and CutMix (α=1.0) applied to 80% of batches.</w:t>
+        <w:t xml:space="preserve">Stanford images are cropped to their ground-truth car bounding box, resized to 224×224, and ImageNet-normalized. CarDD COCO polygons are converted to YOLO-segmentation text labels (normalized polygon vertices) using its provided train/val/test split. carparts-seg ships pre-split. Augmentation for the identifier: RandAugment(2, 9), random-resized-crop, horizontal flip, plus MixUp (α=0.2) and CutMix (α=1.0) applied to 80% of batches.</w:t>
       </w:r>
     </w:p>
     <w:p>
@@ -2192,7 +2192,7 @@
                 <w:sz w:val="18"/>
                 <w:szCs w:val="18"/>
               </w:rPr>
-              <w:t xml:space="preserve">80 / 10 / 10 train/val/test (CarDD); 3,156 / 401 / 276 (carparts-seg).</w:t>
+              <w:t xml:space="preserve">CarDD provided split 2,816 / 810 / 374 (≈70/20/10); carparts-seg 3,156 / 401 / 276.</w:t>
             </w:r>
           </w:p>
         </w:tc>
@@ -3627,7 +3627,7 @@
       <w:r>
         <w:drawing>
           <wp:inline distT="0" distB="0" distL="0" distR="0">
-            <wp:extent cx="4095750" cy="1323975"/>
+            <wp:extent cx="3857625" cy="1247775"/>
             <wp:effectExtent t="0" r="0" b="0" l="0"/>
             <wp:docPr id="1" name="curves_identifier_0.png" descr="curves_identifier_0.png" title="curves_identifier_0.png"/>
             <wp:cNvGraphicFramePr>
@@ -3652,7 +3652,7 @@
                   <pic:spPr bwMode="auto">
                     <a:xfrm>
                       <a:off x="0" y="0"/>
-                      <a:ext cx="4095750" cy="1323975"/>
+                      <a:ext cx="3857625" cy="1247775"/>
                     </a:xfrm>
                     <a:prstGeom prst="rect">
                       <a:avLst/>
@@ -3678,7 +3678,7 @@
           <w:sz w:val="16"/>
           <w:szCs w:val="16"/>
         </w:rPr>
-        <w:t xml:space="preserve">Figure 1. Identifier training/validation loss and top-1 accuracy over 25 epochs. The red marker is the Stage 1→Stage 2 boundary; unfreezing layer3/4 at epoch 4 drives the sharp accuracy jump.</w:t>
+        <w:t xml:space="preserve">Figure 1. Identifier train/val loss and top-1 accuracy over 25 epochs. The red marker is the Stage 1→Stage 2 boundary; unfreezing layer3/4 at epoch 4 drives the sharp accuracy jump.</w:t>
       </w:r>
     </w:p>
     <w:p>
@@ -3689,7 +3689,7 @@
       <w:r>
         <w:drawing>
           <wp:inline distT="0" distB="0" distL="0" distR="0">
-            <wp:extent cx="3143250" cy="2514600"/>
+            <wp:extent cx="2552700" cy="2047875"/>
             <wp:effectExtent t="0" r="0" b="0" l="0"/>
             <wp:docPr id="1" name="f1_identifier_0.png" descr="f1_identifier_0.png" title="f1_identifier_0.png"/>
             <wp:cNvGraphicFramePr>
@@ -3714,7 +3714,7 @@
                   <pic:spPr bwMode="auto">
                     <a:xfrm>
                       <a:off x="0" y="0"/>
-                      <a:ext cx="3143250" cy="2514600"/>
+                      <a:ext cx="2552700" cy="2047875"/>
                     </a:xfrm>
                     <a:prstGeom prst="rect">
                       <a:avLst/>
@@ -3740,7 +3740,7 @@
           <w:sz w:val="16"/>
           <w:szCs w:val="16"/>
         </w:rPr>
-        <w:t xml:space="preserve">Figure 2. Identifier diagnostics: (a) top-20-by-support confusion, (b) 20 weakest classes by F1, (c) make-level confusion (acc 0.854). Most errors confuse trims of the same make — harmless for cost tiering.</w:t>
+        <w:t xml:space="preserve">Figure 2. Identifier diagnostics: (a) top-20 confusion, (b) 20 weakest classes by F1, (c) make-level confusion (acc 0.854). Errors mostly confuse trims of one make — harmless for cost tiering.</w:t>
       </w:r>
     </w:p>
     <w:p>
@@ -3773,7 +3773,7 @@
           <w:sz w:val="19"/>
           <w:szCs w:val="19"/>
         </w:rPr>
-        <w:t xml:space="preserve">What worked: two-stage transfer learning reached 0.77 top-1 on a 196-way fine-grained task from only ~7.3k training images. Make-level accuracy (0.854) comfortably supports the cost tier, which is the metric that matters downstream.</w:t>
+        <w:t xml:space="preserve">Worked: two-stage transfer learning reached 0.77 top-1 on a 196-way fine-grained task from only ~7.3k images, and make-level 0.854 — the metric the cost tier consumes.</w:t>
       </w:r>
     </w:p>
     <w:p>
@@ -3790,7 +3790,7 @@
           <w:sz w:val="19"/>
           <w:szCs w:val="19"/>
         </w:rPr>
-        <w:t xml:space="preserve">What worked: Variant D's parts∩damage intersection produces auditable, per-panel line items and is robust to imperfect masks (a mask only needs to fire in the right region, not be pixel-perfect).</w:t>
+        <w:t xml:space="preserve">Worked: Variant D's parts∩damage intersection gives auditable per-panel line items and tolerates imperfect masks (a mask only needs to fire in the right region, not be pixel-perfect).</w:t>
       </w:r>
     </w:p>
     <w:p>
@@ -3807,7 +3807,23 @@
           <w:sz w:val="19"/>
           <w:szCs w:val="19"/>
         </w:rPr>
-        <w:t xml:space="preserve">What underperformed: Variant C's mask→regressor path scored R² 0.71 on predicted masks versus 0.94 on ground truth — the segmenter's noise, not the feature choice, is the bottleneck. This motivated dropping the regressor in Variant D. Separately, an explored VMMRdb 1,163-class identifier extension regressed to 0.33 (preprocessing mismatch: full-frame vs GT-crop) and was not shipped.</w:t>
+        <w:t xml:space="preserve">Underperformed: Variant C's mask→regressor scored R² 0.71 on predicted masks vs 0.94 on ground truth — segmenter noise, not the feature choice, is the bottleneck (hence Variant D drops the regressor). An explored VMMRdb 1,163-class identifier also regressed to 0.33 (full-frame vs GT-crop preprocessing mismatch) and was not shipped.</w:t>
+      </w:r>
+    </w:p>
+    <w:p>
+      <w:pPr>
+        <w:pStyle w:val="Heading2"/>
+        <w:spacing w:after="40" w:before="100"/>
+      </w:pPr>
+      <w:r>
+        <w:rPr>
+          <w:b/>
+          <w:bCs/>
+          <w:color w:val="2E5F8A"/>
+          <w:sz w:val="20"/>
+          <w:szCs w:val="20"/>
+        </w:rPr>
+        <w:t xml:space="preserve">5.4 Improvements</w:t>
       </w:r>
     </w:p>
     <w:p>
@@ -3824,23 +3840,7 @@
           <w:sz w:val="19"/>
           <w:szCs w:val="19"/>
         </w:rPr>
-        <w:t xml:space="preserve">Confusion structure: errors cluster within a make (year/trim), visible as near-diagonal blocks in Figure 2(a); the make-level heatmap 2(c) is far cleaner.</w:t>
-      </w:r>
-    </w:p>
-    <w:p>
-      <w:pPr>
-        <w:pStyle w:val="Heading2"/>
-        <w:spacing w:after="40" w:before="100"/>
-      </w:pPr>
-      <w:r>
-        <w:rPr>
-          <w:b/>
-          <w:bCs/>
-          <w:color w:val="2E5F8A"/>
-          <w:sz w:val="20"/>
-          <w:szCs w:val="20"/>
-        </w:rPr>
-        <w:t xml:space="preserve">5.4 Improvements</w:t>
+        <w:t xml:space="preserve">Re-label the n=20 end-to-end cost holdout (currently draft labels, indicative only) so MAE/MAPE can be reported with confidence.</w:t>
       </w:r>
     </w:p>
     <w:p>
@@ -3857,7 +3857,7 @@
           <w:sz w:val="19"/>
           <w:szCs w:val="19"/>
         </w:rPr>
-        <w:t xml:space="preserve">Retrain the cost regressor on a hand-labelled holdout: the current n=20 end-to-end cost holdout uses draft labels and is indicative only — a properly labelled set would let MAE/MAPE be reported with confidence.</w:t>
+        <w:t xml:space="preserve">Upgrade the seg backbone (YOLOv8n → s/m) with test-time augmentation to lift mask mAP.</w:t>
       </w:r>
     </w:p>
     <w:p>
@@ -3874,24 +3874,7 @@
           <w:sz w:val="19"/>
           <w:szCs w:val="19"/>
         </w:rPr>
-        <w:t xml:space="preserve">Upgrade the seg backbone (YOLOv8n → s/m) and add test-time augmentation to lift mask mAP, directly improving part attribution.</w:t>
-      </w:r>
-    </w:p>
-    <w:p>
-      <w:pPr>
-        <w:pStyle w:val="ListParagraph"/>
-        <w:numPr>
-          <w:ilvl w:val="0"/>
-          <w:numId w:val="2"/>
-        </w:numPr>
-        <w:spacing w:after="40" w:line="248"/>
-      </w:pPr>
-      <w:r>
-        <w:rPr>
-          <w:sz w:val="19"/>
-          <w:szCs w:val="19"/>
-        </w:rPr>
-        <w:t xml:space="preserve">Add an explicit “undamaged / out-of-distribution” head to reduce false-positive damage on clean cars, and fine-tune the identifier on in-region (e.g. Indian-market) makes for deployment.</w:t>
+        <w:t xml:space="preserve">Add an undamaged / out-of-distribution head to cut false positives on clean cars.</w:t>
       </w:r>
     </w:p>
     <w:sectPr>

</xml_diff>